<commit_message>
Add Dockerfile for containerizing the application
</commit_message>
<xml_diff>
--- a/conexion_db.docx
+++ b/conexion_db.docx
@@ -174,6 +174,955 @@
         <w:t>?&gt;</w:t>
       </w:r>
     </w:p>
+    <w:p/>
+    <w:p>
+      <w:r>
+        <w:drawing>
+          <wp:inline distT="0" distB="0" distL="0" distR="0" wp14:anchorId="410D61D8" wp14:editId="3677932E">
+            <wp:extent cx="5400040" cy="3241675"/>
+            <wp:effectExtent l="0" t="0" r="0" b="0"/>
+            <wp:docPr id="1" name="Imagen 1"/>
+            <wp:cNvGraphicFramePr>
+              <a:graphicFrameLocks xmlns:a="http://schemas.openxmlformats.org/drawingml/2006/main" noChangeAspect="1"/>
+            </wp:cNvGraphicFramePr>
+            <a:graphic xmlns:a="http://schemas.openxmlformats.org/drawingml/2006/main">
+              <a:graphicData uri="http://schemas.openxmlformats.org/drawingml/2006/picture">
+                <pic:pic xmlns:pic="http://schemas.openxmlformats.org/drawingml/2006/picture">
+                  <pic:nvPicPr>
+                    <pic:cNvPr id="1" name=""/>
+                    <pic:cNvPicPr/>
+                  </pic:nvPicPr>
+                  <pic:blipFill>
+                    <a:blip r:embed="rId5"/>
+                    <a:stretch>
+                      <a:fillRect/>
+                    </a:stretch>
+                  </pic:blipFill>
+                  <pic:spPr>
+                    <a:xfrm>
+                      <a:off x="0" y="0"/>
+                      <a:ext cx="5400040" cy="3241675"/>
+                    </a:xfrm>
+                    <a:prstGeom prst="rect">
+                      <a:avLst/>
+                    </a:prstGeom>
+                  </pic:spPr>
+                </pic:pic>
+              </a:graphicData>
+            </a:graphic>
+          </wp:inline>
+        </w:drawing>
+      </w:r>
+    </w:p>
+    <w:p/>
+    <w:p>
+      <w:proofErr w:type="gramStart"/>
+      <w:r>
+        <w:rPr>
+          <w:highlight w:val="yellow"/>
+        </w:rPr>
+        <w:t>URL :</w:t>
+      </w:r>
+      <w:proofErr w:type="gramEnd"/>
+      <w:r>
+        <w:rPr>
+          <w:highlight w:val="yellow"/>
+        </w:rPr>
+        <w:t xml:space="preserve"> </w:t>
+      </w:r>
+      <w:hyperlink r:id="rId6" w:history="1">
+        <w:r>
+          <w:rPr>
+            <w:rStyle w:val="Hipervnculo"/>
+            <w:highlight w:val="yellow"/>
+          </w:rPr>
+          <w:t>https://c270.ferozo.com:2092/extra_soft/phpMyAdmin/index.php?route=/&amp;route=%2F</w:t>
+        </w:r>
+      </w:hyperlink>
+    </w:p>
+    <w:p/>
+    <w:p>
+      <w:r>
+        <w:lastRenderedPageBreak/>
+        <w:drawing>
+          <wp:inline distT="0" distB="0" distL="0" distR="0" wp14:anchorId="49CC0D86" wp14:editId="23E494F6">
+            <wp:extent cx="5400040" cy="4401820"/>
+            <wp:effectExtent l="0" t="0" r="0" b="0"/>
+            <wp:docPr id="2" name="Imagen 2"/>
+            <wp:cNvGraphicFramePr>
+              <a:graphicFrameLocks xmlns:a="http://schemas.openxmlformats.org/drawingml/2006/main" noChangeAspect="1"/>
+            </wp:cNvGraphicFramePr>
+            <a:graphic xmlns:a="http://schemas.openxmlformats.org/drawingml/2006/main">
+              <a:graphicData uri="http://schemas.openxmlformats.org/drawingml/2006/picture">
+                <pic:pic xmlns:pic="http://schemas.openxmlformats.org/drawingml/2006/picture">
+                  <pic:nvPicPr>
+                    <pic:cNvPr id="1" name=""/>
+                    <pic:cNvPicPr/>
+                  </pic:nvPicPr>
+                  <pic:blipFill>
+                    <a:blip r:embed="rId7"/>
+                    <a:stretch>
+                      <a:fillRect/>
+                    </a:stretch>
+                  </pic:blipFill>
+                  <pic:spPr>
+                    <a:xfrm>
+                      <a:off x="0" y="0"/>
+                      <a:ext cx="5400040" cy="4401820"/>
+                    </a:xfrm>
+                    <a:prstGeom prst="rect">
+                      <a:avLst/>
+                    </a:prstGeom>
+                  </pic:spPr>
+                </pic:pic>
+              </a:graphicData>
+            </a:graphic>
+          </wp:inline>
+        </w:drawing>
+      </w:r>
+    </w:p>
+    <w:p/>
+    <w:p>
+      <w:r>
+        <w:rPr>
+          <w:highlight w:val="yellow"/>
+        </w:rPr>
+        <w:t>web-portfolio-production-3c3c.up.railway.app</w:t>
+      </w:r>
+    </w:p>
+    <w:p/>
+    <w:p/>
+    <w:p>
+      <w:r>
+        <w:t>PROMPT CONTEXTO</w:t>
+      </w:r>
+    </w:p>
+    <w:p/>
+    <w:p>
+      <w:r>
+        <w:t xml:space="preserve">Aquí tienes el </w:t>
+      </w:r>
+      <w:proofErr w:type="spellStart"/>
+      <w:r>
+        <w:t>prompt</w:t>
+      </w:r>
+      <w:proofErr w:type="spellEnd"/>
+      <w:r>
+        <w:t xml:space="preserve"> de contexto para retomar la sesión:</w:t>
+      </w:r>
+    </w:p>
+    <w:p>
+      <w:r>
+        <w:pict w14:anchorId="33F85A39">
+          <v:rect id="_x0000_i1037" style="width:0;height:1.5pt" o:hralign="center" o:hrstd="t" o:hr="t" fillcolor="#a0a0a0" stroked="f"/>
+        </w:pict>
+      </w:r>
+    </w:p>
+    <w:p>
+      <w:pPr>
+        <w:rPr>
+          <w:b/>
+          <w:bCs/>
+        </w:rPr>
+      </w:pPr>
+      <w:proofErr w:type="spellStart"/>
+      <w:r>
+        <w:rPr>
+          <w:b/>
+          <w:bCs/>
+        </w:rPr>
+        <w:t>Prompt</w:t>
+      </w:r>
+      <w:proofErr w:type="spellEnd"/>
+      <w:r>
+        <w:rPr>
+          <w:b/>
+          <w:bCs/>
+        </w:rPr>
+        <w:t xml:space="preserve"> de contexto — Despliegue Portfolio Manuel Balbás</w:t>
+      </w:r>
+    </w:p>
+    <w:p>
+      <w:r>
+        <w:t>Estoy desplegando mi portfolio web. Aquí está el estado actual:</w:t>
+      </w:r>
+    </w:p>
+    <w:p>
+      <w:pPr>
+        <w:rPr>
+          <w:b/>
+          <w:bCs/>
+        </w:rPr>
+      </w:pPr>
+      <w:r>
+        <w:rPr>
+          <w:b/>
+          <w:bCs/>
+        </w:rPr>
+        <w:t>Proyecto</w:t>
+      </w:r>
+    </w:p>
+    <w:p>
+      <w:pPr>
+        <w:numPr>
+          <w:ilvl w:val="0"/>
+          <w:numId w:val="1"/>
+        </w:numPr>
+      </w:pPr>
+      <w:r>
+        <w:rPr>
+          <w:b/>
+          <w:bCs/>
+        </w:rPr>
+        <w:t>Repositorio GitHub</w:t>
+      </w:r>
+      <w:r>
+        <w:t>: https://github.com/mmbalbas1132/web-portfolio</w:t>
+      </w:r>
+    </w:p>
+    <w:p>
+      <w:pPr>
+        <w:numPr>
+          <w:ilvl w:val="0"/>
+          <w:numId w:val="1"/>
+        </w:numPr>
+      </w:pPr>
+      <w:proofErr w:type="spellStart"/>
+      <w:r>
+        <w:rPr>
+          <w:b/>
+          <w:bCs/>
+        </w:rPr>
+        <w:t>Frontend</w:t>
+      </w:r>
+      <w:proofErr w:type="spellEnd"/>
+      <w:r>
+        <w:t>: index.html + styles.css (HTML/CSS/JS estático)</w:t>
+      </w:r>
+    </w:p>
+    <w:p>
+      <w:pPr>
+        <w:numPr>
+          <w:ilvl w:val="0"/>
+          <w:numId w:val="1"/>
+        </w:numPr>
+      </w:pPr>
+      <w:proofErr w:type="spellStart"/>
+      <w:r>
+        <w:rPr>
+          <w:b/>
+          <w:bCs/>
+        </w:rPr>
+        <w:t>Backend</w:t>
+      </w:r>
+      <w:proofErr w:type="spellEnd"/>
+      <w:r>
+        <w:t xml:space="preserve">: Spring </w:t>
+      </w:r>
+      <w:proofErr w:type="spellStart"/>
+      <w:r>
+        <w:t>Boot</w:t>
+      </w:r>
+      <w:proofErr w:type="spellEnd"/>
+      <w:r>
+        <w:t xml:space="preserve"> (Java 17, Maven), Spring </w:t>
+      </w:r>
+      <w:proofErr w:type="spellStart"/>
+      <w:r>
+        <w:t>Boot</w:t>
+      </w:r>
+      <w:proofErr w:type="spellEnd"/>
+      <w:r>
+        <w:t xml:space="preserve"> 3.2.3</w:t>
+      </w:r>
+    </w:p>
+    <w:p>
+      <w:pPr>
+        <w:numPr>
+          <w:ilvl w:val="0"/>
+          <w:numId w:val="1"/>
+        </w:numPr>
+      </w:pPr>
+      <w:r>
+        <w:rPr>
+          <w:b/>
+          <w:bCs/>
+        </w:rPr>
+        <w:lastRenderedPageBreak/>
+        <w:t>Base de datos</w:t>
+      </w:r>
+      <w:r>
+        <w:t>: H2 en local (</w:t>
+      </w:r>
+      <w:proofErr w:type="spellStart"/>
+      <w:r>
+        <w:t>dev</w:t>
+      </w:r>
+      <w:proofErr w:type="spellEnd"/>
+      <w:r>
+        <w:t>), MySQL en producción (</w:t>
+      </w:r>
+      <w:proofErr w:type="spellStart"/>
+      <w:r>
+        <w:t>prod</w:t>
+      </w:r>
+      <w:proofErr w:type="spellEnd"/>
+      <w:r>
+        <w:t>)</w:t>
+      </w:r>
+    </w:p>
+    <w:p>
+      <w:pPr>
+        <w:rPr>
+          <w:b/>
+          <w:bCs/>
+        </w:rPr>
+      </w:pPr>
+      <w:r>
+        <w:rPr>
+          <w:b/>
+          <w:bCs/>
+        </w:rPr>
+        <w:t>Infraestructura</w:t>
+      </w:r>
+    </w:p>
+    <w:p>
+      <w:pPr>
+        <w:numPr>
+          <w:ilvl w:val="0"/>
+          <w:numId w:val="2"/>
+        </w:numPr>
+      </w:pPr>
+      <w:r>
+        <w:rPr>
+          <w:b/>
+          <w:bCs/>
+        </w:rPr>
+        <w:t xml:space="preserve">Hosting </w:t>
+      </w:r>
+      <w:proofErr w:type="spellStart"/>
+      <w:r>
+        <w:rPr>
+          <w:b/>
+          <w:bCs/>
+        </w:rPr>
+        <w:t>frontend</w:t>
+      </w:r>
+      <w:proofErr w:type="spellEnd"/>
+      <w:r>
+        <w:t xml:space="preserve">: </w:t>
+      </w:r>
+      <w:proofErr w:type="spellStart"/>
+      <w:r>
+        <w:t>Ferozo</w:t>
+      </w:r>
+      <w:proofErr w:type="spellEnd"/>
+      <w:r>
+        <w:t xml:space="preserve"> (</w:t>
+      </w:r>
+      <w:proofErr w:type="spellStart"/>
+      <w:proofErr w:type="gramStart"/>
+      <w:r>
+        <w:t>dawlugo.website</w:t>
+      </w:r>
+      <w:proofErr w:type="spellEnd"/>
+      <w:proofErr w:type="gramEnd"/>
+      <w:r>
+        <w:t xml:space="preserve">) — styles.css ya subido a </w:t>
+      </w:r>
+      <w:proofErr w:type="spellStart"/>
+      <w:r>
+        <w:t>public_html</w:t>
+      </w:r>
+      <w:proofErr w:type="spellEnd"/>
+      <w:r>
+        <w:t xml:space="preserve"> por FTP</w:t>
+      </w:r>
+    </w:p>
+    <w:p>
+      <w:pPr>
+        <w:numPr>
+          <w:ilvl w:val="0"/>
+          <w:numId w:val="2"/>
+        </w:numPr>
+      </w:pPr>
+      <w:proofErr w:type="spellStart"/>
+      <w:r>
+        <w:rPr>
+          <w:b/>
+          <w:bCs/>
+        </w:rPr>
+        <w:t>Backend</w:t>
+      </w:r>
+      <w:proofErr w:type="spellEnd"/>
+      <w:r>
+        <w:t xml:space="preserve">: </w:t>
+      </w:r>
+      <w:proofErr w:type="spellStart"/>
+      <w:r>
+        <w:t>Railway</w:t>
+      </w:r>
+      <w:proofErr w:type="spellEnd"/>
+      <w:r>
+        <w:t xml:space="preserve"> — proyecto web-portfolio en </w:t>
+      </w:r>
+      <w:proofErr w:type="spellStart"/>
+      <w:r>
+        <w:t>empowering</w:t>
+      </w:r>
+      <w:proofErr w:type="spellEnd"/>
+      <w:r>
+        <w:t>-light/</w:t>
+      </w:r>
+      <w:proofErr w:type="spellStart"/>
+      <w:r>
+        <w:t>production</w:t>
+      </w:r>
+      <w:proofErr w:type="spellEnd"/>
+    </w:p>
+    <w:p>
+      <w:pPr>
+        <w:numPr>
+          <w:ilvl w:val="0"/>
+          <w:numId w:val="2"/>
+        </w:numPr>
+      </w:pPr>
+      <w:r>
+        <w:rPr>
+          <w:b/>
+          <w:bCs/>
+        </w:rPr>
+        <w:t xml:space="preserve">URL pública </w:t>
+      </w:r>
+      <w:proofErr w:type="spellStart"/>
+      <w:r>
+        <w:rPr>
+          <w:b/>
+          <w:bCs/>
+        </w:rPr>
+        <w:t>Railway</w:t>
+      </w:r>
+      <w:proofErr w:type="spellEnd"/>
+      <w:r>
+        <w:t>: https://web-portfolio-production-3c3c.up.railway.app</w:t>
+      </w:r>
+    </w:p>
+    <w:p>
+      <w:pPr>
+        <w:numPr>
+          <w:ilvl w:val="0"/>
+          <w:numId w:val="2"/>
+        </w:numPr>
+      </w:pPr>
+      <w:r>
+        <w:rPr>
+          <w:b/>
+          <w:bCs/>
+        </w:rPr>
+        <w:t>Base de datos MySQL</w:t>
+      </w:r>
+      <w:r>
+        <w:t xml:space="preserve">: </w:t>
+      </w:r>
+      <w:proofErr w:type="spellStart"/>
+      <w:r>
+        <w:t>Ferozo</w:t>
+      </w:r>
+      <w:proofErr w:type="spellEnd"/>
+      <w:r>
+        <w:t xml:space="preserve"> — host c270.ferozo.com, nombre c2701892_portfdb, usuario c2701892_portfdb</w:t>
+      </w:r>
+    </w:p>
+    <w:p>
+      <w:pPr>
+        <w:rPr>
+          <w:b/>
+          <w:bCs/>
+        </w:rPr>
+      </w:pPr>
+      <w:r>
+        <w:rPr>
+          <w:b/>
+          <w:bCs/>
+        </w:rPr>
+        <w:t xml:space="preserve">Variables de entorno en </w:t>
+      </w:r>
+      <w:proofErr w:type="spellStart"/>
+      <w:r>
+        <w:rPr>
+          <w:b/>
+          <w:bCs/>
+        </w:rPr>
+        <w:t>Railway</w:t>
+      </w:r>
+      <w:proofErr w:type="spellEnd"/>
+      <w:r>
+        <w:rPr>
+          <w:b/>
+          <w:bCs/>
+        </w:rPr>
+        <w:t xml:space="preserve"> (ya configuradas)</w:t>
+      </w:r>
+    </w:p>
+    <w:p>
+      <w:pPr>
+        <w:numPr>
+          <w:ilvl w:val="0"/>
+          <w:numId w:val="3"/>
+        </w:numPr>
+      </w:pPr>
+      <w:r>
+        <w:t>SPRING_PROFILES_ACTIVE=</w:t>
+      </w:r>
+      <w:proofErr w:type="spellStart"/>
+      <w:r>
+        <w:t>prod</w:t>
+      </w:r>
+      <w:proofErr w:type="spellEnd"/>
+    </w:p>
+    <w:p>
+      <w:pPr>
+        <w:numPr>
+          <w:ilvl w:val="0"/>
+          <w:numId w:val="3"/>
+        </w:numPr>
+      </w:pPr>
+      <w:r>
+        <w:t>DB_HOST=c270.ferozo.com</w:t>
+      </w:r>
+    </w:p>
+    <w:p>
+      <w:pPr>
+        <w:numPr>
+          <w:ilvl w:val="0"/>
+          <w:numId w:val="3"/>
+        </w:numPr>
+      </w:pPr>
+      <w:r>
+        <w:t>DB_NAME=c2701892_portfdb</w:t>
+      </w:r>
+    </w:p>
+    <w:p>
+      <w:pPr>
+        <w:numPr>
+          <w:ilvl w:val="0"/>
+          <w:numId w:val="3"/>
+        </w:numPr>
+      </w:pPr>
+      <w:r>
+        <w:t>DB_USER=c2701892_portfdb</w:t>
+      </w:r>
+    </w:p>
+    <w:p>
+      <w:pPr>
+        <w:numPr>
+          <w:ilvl w:val="0"/>
+          <w:numId w:val="3"/>
+        </w:numPr>
+      </w:pPr>
+      <w:r>
+        <w:t>DB_PASSWORD=takimu58LE</w:t>
+      </w:r>
+    </w:p>
+    <w:p>
+      <w:pPr>
+        <w:rPr>
+          <w:b/>
+          <w:bCs/>
+        </w:rPr>
+      </w:pPr>
+      <w:r>
+        <w:rPr>
+          <w:b/>
+          <w:bCs/>
+        </w:rPr>
+        <w:t>Problema actual</w:t>
+      </w:r>
+    </w:p>
+    <w:p>
+      <w:proofErr w:type="spellStart"/>
+      <w:r>
+        <w:t>Railway</w:t>
+      </w:r>
+      <w:proofErr w:type="spellEnd"/>
+      <w:r>
+        <w:t xml:space="preserve"> hace el </w:t>
+      </w:r>
+      <w:proofErr w:type="spellStart"/>
+      <w:r>
+        <w:t>build</w:t>
+      </w:r>
+      <w:proofErr w:type="spellEnd"/>
+      <w:r>
+        <w:t xml:space="preserve"> </w:t>
+      </w:r>
+      <w:proofErr w:type="gramStart"/>
+      <w:r>
+        <w:t>correctamente</w:t>
+      </w:r>
+      <w:proofErr w:type="gramEnd"/>
+      <w:r>
+        <w:t xml:space="preserve"> pero al arrancar el contenedor aparece:</w:t>
+      </w:r>
+    </w:p>
+    <w:p>
+      <w:r>
+        <w:t xml:space="preserve">no </w:t>
+      </w:r>
+      <w:proofErr w:type="spellStart"/>
+      <w:r>
+        <w:t>main</w:t>
+      </w:r>
+      <w:proofErr w:type="spellEnd"/>
+      <w:r>
+        <w:t xml:space="preserve"> </w:t>
+      </w:r>
+      <w:proofErr w:type="spellStart"/>
+      <w:r>
+        <w:t>manifest</w:t>
+      </w:r>
+      <w:proofErr w:type="spellEnd"/>
+      <w:r>
+        <w:t xml:space="preserve"> </w:t>
+      </w:r>
+      <w:proofErr w:type="spellStart"/>
+      <w:r>
+        <w:t>attribute</w:t>
+      </w:r>
+      <w:proofErr w:type="spellEnd"/>
+      <w:r>
+        <w:t>, in target/portfolio-backend-0.0.1-SNAPSHOT.jar</w:t>
+      </w:r>
+    </w:p>
+    <w:p>
+      <w:r>
+        <w:t xml:space="preserve">El problema es que </w:t>
+      </w:r>
+      <w:proofErr w:type="spellStart"/>
+      <w:r>
+        <w:t>Railway</w:t>
+      </w:r>
+      <w:proofErr w:type="spellEnd"/>
+      <w:r>
+        <w:t xml:space="preserve"> tiene todo en caché y no recompila limpiamente. El último </w:t>
+      </w:r>
+      <w:proofErr w:type="spellStart"/>
+      <w:r>
+        <w:t>push</w:t>
+      </w:r>
+      <w:proofErr w:type="spellEnd"/>
+      <w:r>
+        <w:t xml:space="preserve"> eliminó el </w:t>
+      </w:r>
+      <w:proofErr w:type="spellStart"/>
+      <w:r>
+        <w:t>Procfile</w:t>
+      </w:r>
+      <w:proofErr w:type="spellEnd"/>
+      <w:r>
+        <w:t xml:space="preserve"> y </w:t>
+      </w:r>
+      <w:proofErr w:type="spellStart"/>
+      <w:proofErr w:type="gramStart"/>
+      <w:r>
+        <w:t>system.properties</w:t>
+      </w:r>
+      <w:proofErr w:type="spellEnd"/>
+      <w:proofErr w:type="gramEnd"/>
+      <w:r>
+        <w:t xml:space="preserve"> para forzar detección limpia de Maven. Aún no se ha visto el resultado de ese último </w:t>
+      </w:r>
+      <w:proofErr w:type="spellStart"/>
+      <w:r>
+        <w:t>push</w:t>
+      </w:r>
+      <w:proofErr w:type="spellEnd"/>
+      <w:r>
+        <w:t>.</w:t>
+      </w:r>
+    </w:p>
+    <w:p>
+      <w:pPr>
+        <w:rPr>
+          <w:b/>
+          <w:bCs/>
+        </w:rPr>
+      </w:pPr>
+      <w:r>
+        <w:rPr>
+          <w:b/>
+          <w:bCs/>
+        </w:rPr>
+        <w:t>Pendiente</w:t>
+      </w:r>
+    </w:p>
+    <w:p>
+      <w:pPr>
+        <w:numPr>
+          <w:ilvl w:val="0"/>
+          <w:numId w:val="4"/>
+        </w:numPr>
+      </w:pPr>
+      <w:r>
+        <w:t xml:space="preserve">Verificar si el último </w:t>
+      </w:r>
+      <w:proofErr w:type="spellStart"/>
+      <w:r>
+        <w:t>deploy</w:t>
+      </w:r>
+      <w:proofErr w:type="spellEnd"/>
+      <w:r>
+        <w:t xml:space="preserve"> en </w:t>
+      </w:r>
+      <w:proofErr w:type="spellStart"/>
+      <w:r>
+        <w:t>Railway</w:t>
+      </w:r>
+      <w:proofErr w:type="spellEnd"/>
+      <w:r>
+        <w:t xml:space="preserve"> funciona tras eliminar el </w:t>
+      </w:r>
+      <w:proofErr w:type="spellStart"/>
+      <w:r>
+        <w:t>Procfile</w:t>
+      </w:r>
+      <w:proofErr w:type="spellEnd"/>
+    </w:p>
+    <w:p>
+      <w:pPr>
+        <w:numPr>
+          <w:ilvl w:val="0"/>
+          <w:numId w:val="4"/>
+        </w:numPr>
+      </w:pPr>
+      <w:r>
+        <w:t xml:space="preserve">Si sigue fallando, añadir un </w:t>
+      </w:r>
+      <w:proofErr w:type="spellStart"/>
+      <w:r>
+        <w:t>Dockerfile</w:t>
+      </w:r>
+      <w:proofErr w:type="spellEnd"/>
+      <w:r>
+        <w:t xml:space="preserve"> al proyecto como solución definitiva</w:t>
+      </w:r>
+    </w:p>
+    <w:p>
+      <w:pPr>
+        <w:numPr>
+          <w:ilvl w:val="0"/>
+          <w:numId w:val="4"/>
+        </w:numPr>
+      </w:pPr>
+      <w:r>
+        <w:t xml:space="preserve">Cuando el </w:t>
+      </w:r>
+      <w:proofErr w:type="spellStart"/>
+      <w:r>
+        <w:t>backend</w:t>
+      </w:r>
+      <w:proofErr w:type="spellEnd"/>
+      <w:r>
+        <w:t xml:space="preserve"> arranque → actualizar </w:t>
+      </w:r>
+      <w:proofErr w:type="spellStart"/>
+      <w:r>
+        <w:t>fetch</w:t>
+      </w:r>
+      <w:proofErr w:type="spellEnd"/>
+      <w:r>
+        <w:t xml:space="preserve"> en index.html con la URL de </w:t>
+      </w:r>
+      <w:proofErr w:type="spellStart"/>
+      <w:r>
+        <w:t>Railway</w:t>
+      </w:r>
+      <w:proofErr w:type="spellEnd"/>
+      <w:r>
+        <w:t xml:space="preserve"> → subir index.html a </w:t>
+      </w:r>
+      <w:proofErr w:type="spellStart"/>
+      <w:r>
+        <w:t>Ferozo</w:t>
+      </w:r>
+      <w:proofErr w:type="spellEnd"/>
+      <w:r>
+        <w:t xml:space="preserve"> por FTP a </w:t>
+      </w:r>
+      <w:proofErr w:type="spellStart"/>
+      <w:r>
+        <w:t>public_html</w:t>
+      </w:r>
+      <w:proofErr w:type="spellEnd"/>
+    </w:p>
+    <w:p>
+      <w:pPr>
+        <w:rPr>
+          <w:b/>
+          <w:bCs/>
+        </w:rPr>
+      </w:pPr>
+      <w:r>
+        <w:rPr>
+          <w:b/>
+          <w:bCs/>
+        </w:rPr>
+        <w:t>Configuración del proyecto</w:t>
+      </w:r>
+    </w:p>
+    <w:p>
+      <w:pPr>
+        <w:numPr>
+          <w:ilvl w:val="0"/>
+          <w:numId w:val="5"/>
+        </w:numPr>
+      </w:pPr>
+      <w:proofErr w:type="spellStart"/>
+      <w:proofErr w:type="gramStart"/>
+      <w:r>
+        <w:t>application.properties</w:t>
+      </w:r>
+      <w:proofErr w:type="spellEnd"/>
+      <w:proofErr w:type="gramEnd"/>
+      <w:r>
+        <w:t xml:space="preserve"> → solo </w:t>
+      </w:r>
+      <w:proofErr w:type="spellStart"/>
+      <w:r>
+        <w:t>spring.profiles.active</w:t>
+      </w:r>
+      <w:proofErr w:type="spellEnd"/>
+      <w:r>
+        <w:t>=</w:t>
+      </w:r>
+      <w:proofErr w:type="spellStart"/>
+      <w:r>
+        <w:t>dev</w:t>
+      </w:r>
+      <w:proofErr w:type="spellEnd"/>
+    </w:p>
+    <w:p>
+      <w:pPr>
+        <w:numPr>
+          <w:ilvl w:val="0"/>
+          <w:numId w:val="5"/>
+        </w:numPr>
+      </w:pPr>
+      <w:proofErr w:type="spellStart"/>
+      <w:r>
+        <w:t>application-</w:t>
+      </w:r>
+      <w:proofErr w:type="gramStart"/>
+      <w:r>
+        <w:t>dev.properties</w:t>
+      </w:r>
+      <w:proofErr w:type="spellEnd"/>
+      <w:proofErr w:type="gramEnd"/>
+      <w:r>
+        <w:t xml:space="preserve"> → H2 en memoria</w:t>
+      </w:r>
+    </w:p>
+    <w:p>
+      <w:pPr>
+        <w:numPr>
+          <w:ilvl w:val="0"/>
+          <w:numId w:val="5"/>
+        </w:numPr>
+      </w:pPr>
+      <w:proofErr w:type="spellStart"/>
+      <w:r>
+        <w:lastRenderedPageBreak/>
+        <w:t>application-</w:t>
+      </w:r>
+      <w:proofErr w:type="gramStart"/>
+      <w:r>
+        <w:t>prod.properties</w:t>
+      </w:r>
+      <w:proofErr w:type="spellEnd"/>
+      <w:proofErr w:type="gramEnd"/>
+      <w:r>
+        <w:t xml:space="preserve"> → MySQL con variables de entorno ${DB_HOST}, ${DB_NAME}, ${DB_USER}, ${DB_PASSWORD}</w:t>
+      </w:r>
+    </w:p>
+    <w:p>
+      <w:pPr>
+        <w:numPr>
+          <w:ilvl w:val="0"/>
+          <w:numId w:val="5"/>
+        </w:numPr>
+      </w:pPr>
+      <w:r>
+        <w:t xml:space="preserve">pom.xml tiene el </w:t>
+      </w:r>
+      <w:proofErr w:type="spellStart"/>
+      <w:r>
+        <w:t>spring</w:t>
+      </w:r>
+      <w:proofErr w:type="spellEnd"/>
+      <w:r>
+        <w:t>-</w:t>
+      </w:r>
+      <w:proofErr w:type="spellStart"/>
+      <w:r>
+        <w:t>boot</w:t>
+      </w:r>
+      <w:proofErr w:type="spellEnd"/>
+      <w:r>
+        <w:t>-</w:t>
+      </w:r>
+      <w:proofErr w:type="spellStart"/>
+      <w:r>
+        <w:t>maven</w:t>
+      </w:r>
+      <w:proofErr w:type="spellEnd"/>
+      <w:r>
+        <w:t xml:space="preserve">-plugin con el </w:t>
+      </w:r>
+      <w:proofErr w:type="spellStart"/>
+      <w:r>
+        <w:t>goal</w:t>
+      </w:r>
+      <w:proofErr w:type="spellEnd"/>
+      <w:r>
+        <w:t xml:space="preserve"> </w:t>
+      </w:r>
+      <w:proofErr w:type="spellStart"/>
+      <w:r>
+        <w:t>repackage</w:t>
+      </w:r>
+      <w:proofErr w:type="spellEnd"/>
+    </w:p>
+    <w:p>
+      <w:r>
+        <w:pict w14:anchorId="59A9FE0B">
+          <v:rect id="_x0000_i1038" style="width:0;height:1.5pt" o:hralign="center" o:hrstd="t" o:hr="t" fillcolor="#a0a0a0" stroked="f"/>
+        </w:pict>
+      </w:r>
+    </w:p>
+    <w:p>
+      <w:r>
+        <w:t xml:space="preserve">Copia este </w:t>
+      </w:r>
+      <w:proofErr w:type="spellStart"/>
+      <w:r>
+        <w:t>prompt</w:t>
+      </w:r>
+      <w:proofErr w:type="spellEnd"/>
+      <w:r>
+        <w:t xml:space="preserve"> al inicio de la próxima sesión y di </w:t>
+      </w:r>
+      <w:r>
+        <w:rPr>
+          <w:b/>
+          <w:bCs/>
+        </w:rPr>
+        <w:t>"Consulta el contexto y continuamos"</w:t>
+      </w:r>
+      <w:r>
+        <w:t>. ¡Hasta pronto!</w:t>
+      </w:r>
+    </w:p>
+    <w:p/>
     <w:sectPr>
       <w:pgSz w:w="11906" w:h="16838"/>
       <w:pgMar w:top="1417" w:right="1701" w:bottom="1417" w:left="1701" w:header="708" w:footer="708" w:gutter="0"/>
@@ -182,6 +1131,735 @@
     </w:sectPr>
   </w:body>
 </w:document>
+</file>
+
+<file path=word/numbering.xml><?xml version="1.0" encoding="utf-8"?>
+<w:numbering xmlns:wpc="http://schemas.microsoft.com/office/word/2010/wordprocessingCanvas" xmlns:cx="http://schemas.microsoft.com/office/drawing/2014/chartex" xmlns:cx1="http://schemas.microsoft.com/office/drawing/2015/9/8/chartex" xmlns:cx2="http://schemas.microsoft.com/office/drawing/2015/10/21/chartex" xmlns:cx3="http://schemas.microsoft.com/office/drawing/2016/5/9/chartex" xmlns:cx4="http://schemas.microsoft.com/office/drawing/2016/5/10/chartex" xmlns:cx5="http://schemas.microsoft.com/office/drawing/2016/5/11/chartex" xmlns:cx6="http://schemas.microsoft.com/office/drawing/2016/5/12/chartex" xmlns:cx7="http://schemas.microsoft.com/office/drawing/2016/5/13/chartex" xmlns:cx8="http://schemas.microsoft.com/office/drawing/2016/5/14/chartex" xmlns:mc="http://schemas.openxmlformats.org/markup-compatibility/2006" xmlns:aink="http://schemas.microsoft.com/office/drawing/2016/ink" xmlns:am3d="http://schemas.microsoft.com/office/drawing/2017/model3d" xmlns:o="urn:schemas-microsoft-com:office:office" xmlns:oel="http://schemas.microsoft.com/office/2019/extlst" xmlns:r="http://schemas.openxmlformats.org/officeDocument/2006/relationships" xmlns:m="http://schemas.openxmlformats.org/officeDocument/2006/math" xmlns:v="urn:schemas-microsoft-com:vml" xmlns:wp14="http://schemas.microsoft.com/office/word/2010/wordprocessingDrawing" xmlns:wp="http://schemas.openxmlformats.org/drawingml/2006/wordprocessingDrawing" xmlns:w10="urn:schemas-microsoft-com:office:word" xmlns:w="http://schemas.openxmlformats.org/wordprocessingml/2006/main" xmlns:w14="http://schemas.microsoft.com/office/word/2010/wordml" xmlns:w15="http://schemas.microsoft.com/office/word/2012/wordml" xmlns:w16cex="http://schemas.microsoft.com/office/word/2018/wordml/cex" xmlns:w16cid="http://schemas.microsoft.com/office/word/2016/wordml/cid" xmlns:w16="http://schemas.microsoft.com/office/word/2018/wordml" xmlns:w16sdtdh="http://schemas.microsoft.com/office/word/2020/wordml/sdtdatahash" xmlns:w16se="http://schemas.microsoft.com/office/word/2015/wordml/symex" xmlns:wpg="http://schemas.microsoft.com/office/word/2010/wordprocessingGroup" xmlns:wpi="http://schemas.microsoft.com/office/word/2010/wordprocessingInk" xmlns:wne="http://schemas.microsoft.com/office/word/2006/wordml" xmlns:wps="http://schemas.microsoft.com/office/word/2010/wordprocessingShape" mc:Ignorable="w14 w15 w16se w16cid w16 w16cex w16sdtdh wp14">
+  <w:abstractNum w:abstractNumId="0" w15:restartNumberingAfterBreak="0">
+    <w:nsid w:val="31694488"/>
+    <w:multiLevelType w:val="multilevel"/>
+    <w:tmpl w:val="A44C9208"/>
+    <w:lvl w:ilvl="0">
+      <w:start w:val="1"/>
+      <w:numFmt w:val="bullet"/>
+      <w:lvlText w:val=""/>
+      <w:lvlJc w:val="left"/>
+      <w:pPr>
+        <w:tabs>
+          <w:tab w:val="num" w:pos="720"/>
+        </w:tabs>
+        <w:ind w:left="720" w:hanging="360"/>
+      </w:pPr>
+      <w:rPr>
+        <w:rFonts w:ascii="Symbol" w:hAnsi="Symbol" w:hint="default"/>
+        <w:sz w:val="20"/>
+      </w:rPr>
+    </w:lvl>
+    <w:lvl w:ilvl="1" w:tentative="1">
+      <w:start w:val="1"/>
+      <w:numFmt w:val="bullet"/>
+      <w:lvlText w:val="o"/>
+      <w:lvlJc w:val="left"/>
+      <w:pPr>
+        <w:tabs>
+          <w:tab w:val="num" w:pos="1440"/>
+        </w:tabs>
+        <w:ind w:left="1440" w:hanging="360"/>
+      </w:pPr>
+      <w:rPr>
+        <w:rFonts w:ascii="Courier New" w:hAnsi="Courier New" w:hint="default"/>
+        <w:sz w:val="20"/>
+      </w:rPr>
+    </w:lvl>
+    <w:lvl w:ilvl="2" w:tentative="1">
+      <w:start w:val="1"/>
+      <w:numFmt w:val="bullet"/>
+      <w:lvlText w:val=""/>
+      <w:lvlJc w:val="left"/>
+      <w:pPr>
+        <w:tabs>
+          <w:tab w:val="num" w:pos="2160"/>
+        </w:tabs>
+        <w:ind w:left="2160" w:hanging="360"/>
+      </w:pPr>
+      <w:rPr>
+        <w:rFonts w:ascii="Wingdings" w:hAnsi="Wingdings" w:hint="default"/>
+        <w:sz w:val="20"/>
+      </w:rPr>
+    </w:lvl>
+    <w:lvl w:ilvl="3" w:tentative="1">
+      <w:start w:val="1"/>
+      <w:numFmt w:val="bullet"/>
+      <w:lvlText w:val=""/>
+      <w:lvlJc w:val="left"/>
+      <w:pPr>
+        <w:tabs>
+          <w:tab w:val="num" w:pos="2880"/>
+        </w:tabs>
+        <w:ind w:left="2880" w:hanging="360"/>
+      </w:pPr>
+      <w:rPr>
+        <w:rFonts w:ascii="Wingdings" w:hAnsi="Wingdings" w:hint="default"/>
+        <w:sz w:val="20"/>
+      </w:rPr>
+    </w:lvl>
+    <w:lvl w:ilvl="4" w:tentative="1">
+      <w:start w:val="1"/>
+      <w:numFmt w:val="bullet"/>
+      <w:lvlText w:val=""/>
+      <w:lvlJc w:val="left"/>
+      <w:pPr>
+        <w:tabs>
+          <w:tab w:val="num" w:pos="3600"/>
+        </w:tabs>
+        <w:ind w:left="3600" w:hanging="360"/>
+      </w:pPr>
+      <w:rPr>
+        <w:rFonts w:ascii="Wingdings" w:hAnsi="Wingdings" w:hint="default"/>
+        <w:sz w:val="20"/>
+      </w:rPr>
+    </w:lvl>
+    <w:lvl w:ilvl="5" w:tentative="1">
+      <w:start w:val="1"/>
+      <w:numFmt w:val="bullet"/>
+      <w:lvlText w:val=""/>
+      <w:lvlJc w:val="left"/>
+      <w:pPr>
+        <w:tabs>
+          <w:tab w:val="num" w:pos="4320"/>
+        </w:tabs>
+        <w:ind w:left="4320" w:hanging="360"/>
+      </w:pPr>
+      <w:rPr>
+        <w:rFonts w:ascii="Wingdings" w:hAnsi="Wingdings" w:hint="default"/>
+        <w:sz w:val="20"/>
+      </w:rPr>
+    </w:lvl>
+    <w:lvl w:ilvl="6" w:tentative="1">
+      <w:start w:val="1"/>
+      <w:numFmt w:val="bullet"/>
+      <w:lvlText w:val=""/>
+      <w:lvlJc w:val="left"/>
+      <w:pPr>
+        <w:tabs>
+          <w:tab w:val="num" w:pos="5040"/>
+        </w:tabs>
+        <w:ind w:left="5040" w:hanging="360"/>
+      </w:pPr>
+      <w:rPr>
+        <w:rFonts w:ascii="Wingdings" w:hAnsi="Wingdings" w:hint="default"/>
+        <w:sz w:val="20"/>
+      </w:rPr>
+    </w:lvl>
+    <w:lvl w:ilvl="7" w:tentative="1">
+      <w:start w:val="1"/>
+      <w:numFmt w:val="bullet"/>
+      <w:lvlText w:val=""/>
+      <w:lvlJc w:val="left"/>
+      <w:pPr>
+        <w:tabs>
+          <w:tab w:val="num" w:pos="5760"/>
+        </w:tabs>
+        <w:ind w:left="5760" w:hanging="360"/>
+      </w:pPr>
+      <w:rPr>
+        <w:rFonts w:ascii="Wingdings" w:hAnsi="Wingdings" w:hint="default"/>
+        <w:sz w:val="20"/>
+      </w:rPr>
+    </w:lvl>
+    <w:lvl w:ilvl="8" w:tentative="1">
+      <w:start w:val="1"/>
+      <w:numFmt w:val="bullet"/>
+      <w:lvlText w:val=""/>
+      <w:lvlJc w:val="left"/>
+      <w:pPr>
+        <w:tabs>
+          <w:tab w:val="num" w:pos="6480"/>
+        </w:tabs>
+        <w:ind w:left="6480" w:hanging="360"/>
+      </w:pPr>
+      <w:rPr>
+        <w:rFonts w:ascii="Wingdings" w:hAnsi="Wingdings" w:hint="default"/>
+        <w:sz w:val="20"/>
+      </w:rPr>
+    </w:lvl>
+  </w:abstractNum>
+  <w:abstractNum w:abstractNumId="1" w15:restartNumberingAfterBreak="0">
+    <w:nsid w:val="587A0E74"/>
+    <w:multiLevelType w:val="multilevel"/>
+    <w:tmpl w:val="750A8D3E"/>
+    <w:lvl w:ilvl="0">
+      <w:start w:val="1"/>
+      <w:numFmt w:val="bullet"/>
+      <w:lvlText w:val=""/>
+      <w:lvlJc w:val="left"/>
+      <w:pPr>
+        <w:tabs>
+          <w:tab w:val="num" w:pos="720"/>
+        </w:tabs>
+        <w:ind w:left="720" w:hanging="360"/>
+      </w:pPr>
+      <w:rPr>
+        <w:rFonts w:ascii="Symbol" w:hAnsi="Symbol" w:hint="default"/>
+        <w:sz w:val="20"/>
+      </w:rPr>
+    </w:lvl>
+    <w:lvl w:ilvl="1" w:tentative="1">
+      <w:start w:val="1"/>
+      <w:numFmt w:val="bullet"/>
+      <w:lvlText w:val="o"/>
+      <w:lvlJc w:val="left"/>
+      <w:pPr>
+        <w:tabs>
+          <w:tab w:val="num" w:pos="1440"/>
+        </w:tabs>
+        <w:ind w:left="1440" w:hanging="360"/>
+      </w:pPr>
+      <w:rPr>
+        <w:rFonts w:ascii="Courier New" w:hAnsi="Courier New" w:hint="default"/>
+        <w:sz w:val="20"/>
+      </w:rPr>
+    </w:lvl>
+    <w:lvl w:ilvl="2" w:tentative="1">
+      <w:start w:val="1"/>
+      <w:numFmt w:val="bullet"/>
+      <w:lvlText w:val=""/>
+      <w:lvlJc w:val="left"/>
+      <w:pPr>
+        <w:tabs>
+          <w:tab w:val="num" w:pos="2160"/>
+        </w:tabs>
+        <w:ind w:left="2160" w:hanging="360"/>
+      </w:pPr>
+      <w:rPr>
+        <w:rFonts w:ascii="Wingdings" w:hAnsi="Wingdings" w:hint="default"/>
+        <w:sz w:val="20"/>
+      </w:rPr>
+    </w:lvl>
+    <w:lvl w:ilvl="3" w:tentative="1">
+      <w:start w:val="1"/>
+      <w:numFmt w:val="bullet"/>
+      <w:lvlText w:val=""/>
+      <w:lvlJc w:val="left"/>
+      <w:pPr>
+        <w:tabs>
+          <w:tab w:val="num" w:pos="2880"/>
+        </w:tabs>
+        <w:ind w:left="2880" w:hanging="360"/>
+      </w:pPr>
+      <w:rPr>
+        <w:rFonts w:ascii="Wingdings" w:hAnsi="Wingdings" w:hint="default"/>
+        <w:sz w:val="20"/>
+      </w:rPr>
+    </w:lvl>
+    <w:lvl w:ilvl="4" w:tentative="1">
+      <w:start w:val="1"/>
+      <w:numFmt w:val="bullet"/>
+      <w:lvlText w:val=""/>
+      <w:lvlJc w:val="left"/>
+      <w:pPr>
+        <w:tabs>
+          <w:tab w:val="num" w:pos="3600"/>
+        </w:tabs>
+        <w:ind w:left="3600" w:hanging="360"/>
+      </w:pPr>
+      <w:rPr>
+        <w:rFonts w:ascii="Wingdings" w:hAnsi="Wingdings" w:hint="default"/>
+        <w:sz w:val="20"/>
+      </w:rPr>
+    </w:lvl>
+    <w:lvl w:ilvl="5" w:tentative="1">
+      <w:start w:val="1"/>
+      <w:numFmt w:val="bullet"/>
+      <w:lvlText w:val=""/>
+      <w:lvlJc w:val="left"/>
+      <w:pPr>
+        <w:tabs>
+          <w:tab w:val="num" w:pos="4320"/>
+        </w:tabs>
+        <w:ind w:left="4320" w:hanging="360"/>
+      </w:pPr>
+      <w:rPr>
+        <w:rFonts w:ascii="Wingdings" w:hAnsi="Wingdings" w:hint="default"/>
+        <w:sz w:val="20"/>
+      </w:rPr>
+    </w:lvl>
+    <w:lvl w:ilvl="6" w:tentative="1">
+      <w:start w:val="1"/>
+      <w:numFmt w:val="bullet"/>
+      <w:lvlText w:val=""/>
+      <w:lvlJc w:val="left"/>
+      <w:pPr>
+        <w:tabs>
+          <w:tab w:val="num" w:pos="5040"/>
+        </w:tabs>
+        <w:ind w:left="5040" w:hanging="360"/>
+      </w:pPr>
+      <w:rPr>
+        <w:rFonts w:ascii="Wingdings" w:hAnsi="Wingdings" w:hint="default"/>
+        <w:sz w:val="20"/>
+      </w:rPr>
+    </w:lvl>
+    <w:lvl w:ilvl="7" w:tentative="1">
+      <w:start w:val="1"/>
+      <w:numFmt w:val="bullet"/>
+      <w:lvlText w:val=""/>
+      <w:lvlJc w:val="left"/>
+      <w:pPr>
+        <w:tabs>
+          <w:tab w:val="num" w:pos="5760"/>
+        </w:tabs>
+        <w:ind w:left="5760" w:hanging="360"/>
+      </w:pPr>
+      <w:rPr>
+        <w:rFonts w:ascii="Wingdings" w:hAnsi="Wingdings" w:hint="default"/>
+        <w:sz w:val="20"/>
+      </w:rPr>
+    </w:lvl>
+    <w:lvl w:ilvl="8" w:tentative="1">
+      <w:start w:val="1"/>
+      <w:numFmt w:val="bullet"/>
+      <w:lvlText w:val=""/>
+      <w:lvlJc w:val="left"/>
+      <w:pPr>
+        <w:tabs>
+          <w:tab w:val="num" w:pos="6480"/>
+        </w:tabs>
+        <w:ind w:left="6480" w:hanging="360"/>
+      </w:pPr>
+      <w:rPr>
+        <w:rFonts w:ascii="Wingdings" w:hAnsi="Wingdings" w:hint="default"/>
+        <w:sz w:val="20"/>
+      </w:rPr>
+    </w:lvl>
+  </w:abstractNum>
+  <w:abstractNum w:abstractNumId="2" w15:restartNumberingAfterBreak="0">
+    <w:nsid w:val="5E5E7C50"/>
+    <w:multiLevelType w:val="multilevel"/>
+    <w:tmpl w:val="B1848968"/>
+    <w:lvl w:ilvl="0">
+      <w:start w:val="1"/>
+      <w:numFmt w:val="decimal"/>
+      <w:lvlText w:val="%1."/>
+      <w:lvlJc w:val="left"/>
+      <w:pPr>
+        <w:tabs>
+          <w:tab w:val="num" w:pos="720"/>
+        </w:tabs>
+        <w:ind w:left="720" w:hanging="360"/>
+      </w:pPr>
+    </w:lvl>
+    <w:lvl w:ilvl="1" w:tentative="1">
+      <w:start w:val="1"/>
+      <w:numFmt w:val="decimal"/>
+      <w:lvlText w:val="%2."/>
+      <w:lvlJc w:val="left"/>
+      <w:pPr>
+        <w:tabs>
+          <w:tab w:val="num" w:pos="1440"/>
+        </w:tabs>
+        <w:ind w:left="1440" w:hanging="360"/>
+      </w:pPr>
+    </w:lvl>
+    <w:lvl w:ilvl="2" w:tentative="1">
+      <w:start w:val="1"/>
+      <w:numFmt w:val="decimal"/>
+      <w:lvlText w:val="%3."/>
+      <w:lvlJc w:val="left"/>
+      <w:pPr>
+        <w:tabs>
+          <w:tab w:val="num" w:pos="2160"/>
+        </w:tabs>
+        <w:ind w:left="2160" w:hanging="360"/>
+      </w:pPr>
+    </w:lvl>
+    <w:lvl w:ilvl="3" w:tentative="1">
+      <w:start w:val="1"/>
+      <w:numFmt w:val="decimal"/>
+      <w:lvlText w:val="%4."/>
+      <w:lvlJc w:val="left"/>
+      <w:pPr>
+        <w:tabs>
+          <w:tab w:val="num" w:pos="2880"/>
+        </w:tabs>
+        <w:ind w:left="2880" w:hanging="360"/>
+      </w:pPr>
+    </w:lvl>
+    <w:lvl w:ilvl="4" w:tentative="1">
+      <w:start w:val="1"/>
+      <w:numFmt w:val="decimal"/>
+      <w:lvlText w:val="%5."/>
+      <w:lvlJc w:val="left"/>
+      <w:pPr>
+        <w:tabs>
+          <w:tab w:val="num" w:pos="3600"/>
+        </w:tabs>
+        <w:ind w:left="3600" w:hanging="360"/>
+      </w:pPr>
+    </w:lvl>
+    <w:lvl w:ilvl="5" w:tentative="1">
+      <w:start w:val="1"/>
+      <w:numFmt w:val="decimal"/>
+      <w:lvlText w:val="%6."/>
+      <w:lvlJc w:val="left"/>
+      <w:pPr>
+        <w:tabs>
+          <w:tab w:val="num" w:pos="4320"/>
+        </w:tabs>
+        <w:ind w:left="4320" w:hanging="360"/>
+      </w:pPr>
+    </w:lvl>
+    <w:lvl w:ilvl="6" w:tentative="1">
+      <w:start w:val="1"/>
+      <w:numFmt w:val="decimal"/>
+      <w:lvlText w:val="%7."/>
+      <w:lvlJc w:val="left"/>
+      <w:pPr>
+        <w:tabs>
+          <w:tab w:val="num" w:pos="5040"/>
+        </w:tabs>
+        <w:ind w:left="5040" w:hanging="360"/>
+      </w:pPr>
+    </w:lvl>
+    <w:lvl w:ilvl="7" w:tentative="1">
+      <w:start w:val="1"/>
+      <w:numFmt w:val="decimal"/>
+      <w:lvlText w:val="%8."/>
+      <w:lvlJc w:val="left"/>
+      <w:pPr>
+        <w:tabs>
+          <w:tab w:val="num" w:pos="5760"/>
+        </w:tabs>
+        <w:ind w:left="5760" w:hanging="360"/>
+      </w:pPr>
+    </w:lvl>
+    <w:lvl w:ilvl="8" w:tentative="1">
+      <w:start w:val="1"/>
+      <w:numFmt w:val="decimal"/>
+      <w:lvlText w:val="%9."/>
+      <w:lvlJc w:val="left"/>
+      <w:pPr>
+        <w:tabs>
+          <w:tab w:val="num" w:pos="6480"/>
+        </w:tabs>
+        <w:ind w:left="6480" w:hanging="360"/>
+      </w:pPr>
+    </w:lvl>
+  </w:abstractNum>
+  <w:abstractNum w:abstractNumId="3" w15:restartNumberingAfterBreak="0">
+    <w:nsid w:val="76590342"/>
+    <w:multiLevelType w:val="multilevel"/>
+    <w:tmpl w:val="775EE364"/>
+    <w:lvl w:ilvl="0">
+      <w:start w:val="1"/>
+      <w:numFmt w:val="bullet"/>
+      <w:lvlText w:val=""/>
+      <w:lvlJc w:val="left"/>
+      <w:pPr>
+        <w:tabs>
+          <w:tab w:val="num" w:pos="720"/>
+        </w:tabs>
+        <w:ind w:left="720" w:hanging="360"/>
+      </w:pPr>
+      <w:rPr>
+        <w:rFonts w:ascii="Symbol" w:hAnsi="Symbol" w:hint="default"/>
+        <w:sz w:val="20"/>
+      </w:rPr>
+    </w:lvl>
+    <w:lvl w:ilvl="1" w:tentative="1">
+      <w:start w:val="1"/>
+      <w:numFmt w:val="bullet"/>
+      <w:lvlText w:val="o"/>
+      <w:lvlJc w:val="left"/>
+      <w:pPr>
+        <w:tabs>
+          <w:tab w:val="num" w:pos="1440"/>
+        </w:tabs>
+        <w:ind w:left="1440" w:hanging="360"/>
+      </w:pPr>
+      <w:rPr>
+        <w:rFonts w:ascii="Courier New" w:hAnsi="Courier New" w:hint="default"/>
+        <w:sz w:val="20"/>
+      </w:rPr>
+    </w:lvl>
+    <w:lvl w:ilvl="2" w:tentative="1">
+      <w:start w:val="1"/>
+      <w:numFmt w:val="bullet"/>
+      <w:lvlText w:val=""/>
+      <w:lvlJc w:val="left"/>
+      <w:pPr>
+        <w:tabs>
+          <w:tab w:val="num" w:pos="2160"/>
+        </w:tabs>
+        <w:ind w:left="2160" w:hanging="360"/>
+      </w:pPr>
+      <w:rPr>
+        <w:rFonts w:ascii="Wingdings" w:hAnsi="Wingdings" w:hint="default"/>
+        <w:sz w:val="20"/>
+      </w:rPr>
+    </w:lvl>
+    <w:lvl w:ilvl="3" w:tentative="1">
+      <w:start w:val="1"/>
+      <w:numFmt w:val="bullet"/>
+      <w:lvlText w:val=""/>
+      <w:lvlJc w:val="left"/>
+      <w:pPr>
+        <w:tabs>
+          <w:tab w:val="num" w:pos="2880"/>
+        </w:tabs>
+        <w:ind w:left="2880" w:hanging="360"/>
+      </w:pPr>
+      <w:rPr>
+        <w:rFonts w:ascii="Wingdings" w:hAnsi="Wingdings" w:hint="default"/>
+        <w:sz w:val="20"/>
+      </w:rPr>
+    </w:lvl>
+    <w:lvl w:ilvl="4" w:tentative="1">
+      <w:start w:val="1"/>
+      <w:numFmt w:val="bullet"/>
+      <w:lvlText w:val=""/>
+      <w:lvlJc w:val="left"/>
+      <w:pPr>
+        <w:tabs>
+          <w:tab w:val="num" w:pos="3600"/>
+        </w:tabs>
+        <w:ind w:left="3600" w:hanging="360"/>
+      </w:pPr>
+      <w:rPr>
+        <w:rFonts w:ascii="Wingdings" w:hAnsi="Wingdings" w:hint="default"/>
+        <w:sz w:val="20"/>
+      </w:rPr>
+    </w:lvl>
+    <w:lvl w:ilvl="5" w:tentative="1">
+      <w:start w:val="1"/>
+      <w:numFmt w:val="bullet"/>
+      <w:lvlText w:val=""/>
+      <w:lvlJc w:val="left"/>
+      <w:pPr>
+        <w:tabs>
+          <w:tab w:val="num" w:pos="4320"/>
+        </w:tabs>
+        <w:ind w:left="4320" w:hanging="360"/>
+      </w:pPr>
+      <w:rPr>
+        <w:rFonts w:ascii="Wingdings" w:hAnsi="Wingdings" w:hint="default"/>
+        <w:sz w:val="20"/>
+      </w:rPr>
+    </w:lvl>
+    <w:lvl w:ilvl="6" w:tentative="1">
+      <w:start w:val="1"/>
+      <w:numFmt w:val="bullet"/>
+      <w:lvlText w:val=""/>
+      <w:lvlJc w:val="left"/>
+      <w:pPr>
+        <w:tabs>
+          <w:tab w:val="num" w:pos="5040"/>
+        </w:tabs>
+        <w:ind w:left="5040" w:hanging="360"/>
+      </w:pPr>
+      <w:rPr>
+        <w:rFonts w:ascii="Wingdings" w:hAnsi="Wingdings" w:hint="default"/>
+        <w:sz w:val="20"/>
+      </w:rPr>
+    </w:lvl>
+    <w:lvl w:ilvl="7" w:tentative="1">
+      <w:start w:val="1"/>
+      <w:numFmt w:val="bullet"/>
+      <w:lvlText w:val=""/>
+      <w:lvlJc w:val="left"/>
+      <w:pPr>
+        <w:tabs>
+          <w:tab w:val="num" w:pos="5760"/>
+        </w:tabs>
+        <w:ind w:left="5760" w:hanging="360"/>
+      </w:pPr>
+      <w:rPr>
+        <w:rFonts w:ascii="Wingdings" w:hAnsi="Wingdings" w:hint="default"/>
+        <w:sz w:val="20"/>
+      </w:rPr>
+    </w:lvl>
+    <w:lvl w:ilvl="8" w:tentative="1">
+      <w:start w:val="1"/>
+      <w:numFmt w:val="bullet"/>
+      <w:lvlText w:val=""/>
+      <w:lvlJc w:val="left"/>
+      <w:pPr>
+        <w:tabs>
+          <w:tab w:val="num" w:pos="6480"/>
+        </w:tabs>
+        <w:ind w:left="6480" w:hanging="360"/>
+      </w:pPr>
+      <w:rPr>
+        <w:rFonts w:ascii="Wingdings" w:hAnsi="Wingdings" w:hint="default"/>
+        <w:sz w:val="20"/>
+      </w:rPr>
+    </w:lvl>
+  </w:abstractNum>
+  <w:abstractNum w:abstractNumId="4" w15:restartNumberingAfterBreak="0">
+    <w:nsid w:val="79854633"/>
+    <w:multiLevelType w:val="multilevel"/>
+    <w:tmpl w:val="C10EC1F8"/>
+    <w:lvl w:ilvl="0">
+      <w:start w:val="1"/>
+      <w:numFmt w:val="bullet"/>
+      <w:lvlText w:val=""/>
+      <w:lvlJc w:val="left"/>
+      <w:pPr>
+        <w:tabs>
+          <w:tab w:val="num" w:pos="720"/>
+        </w:tabs>
+        <w:ind w:left="720" w:hanging="360"/>
+      </w:pPr>
+      <w:rPr>
+        <w:rFonts w:ascii="Symbol" w:hAnsi="Symbol" w:hint="default"/>
+        <w:sz w:val="20"/>
+      </w:rPr>
+    </w:lvl>
+    <w:lvl w:ilvl="1" w:tentative="1">
+      <w:start w:val="1"/>
+      <w:numFmt w:val="bullet"/>
+      <w:lvlText w:val="o"/>
+      <w:lvlJc w:val="left"/>
+      <w:pPr>
+        <w:tabs>
+          <w:tab w:val="num" w:pos="1440"/>
+        </w:tabs>
+        <w:ind w:left="1440" w:hanging="360"/>
+      </w:pPr>
+      <w:rPr>
+        <w:rFonts w:ascii="Courier New" w:hAnsi="Courier New" w:hint="default"/>
+        <w:sz w:val="20"/>
+      </w:rPr>
+    </w:lvl>
+    <w:lvl w:ilvl="2" w:tentative="1">
+      <w:start w:val="1"/>
+      <w:numFmt w:val="bullet"/>
+      <w:lvlText w:val=""/>
+      <w:lvlJc w:val="left"/>
+      <w:pPr>
+        <w:tabs>
+          <w:tab w:val="num" w:pos="2160"/>
+        </w:tabs>
+        <w:ind w:left="2160" w:hanging="360"/>
+      </w:pPr>
+      <w:rPr>
+        <w:rFonts w:ascii="Wingdings" w:hAnsi="Wingdings" w:hint="default"/>
+        <w:sz w:val="20"/>
+      </w:rPr>
+    </w:lvl>
+    <w:lvl w:ilvl="3" w:tentative="1">
+      <w:start w:val="1"/>
+      <w:numFmt w:val="bullet"/>
+      <w:lvlText w:val=""/>
+      <w:lvlJc w:val="left"/>
+      <w:pPr>
+        <w:tabs>
+          <w:tab w:val="num" w:pos="2880"/>
+        </w:tabs>
+        <w:ind w:left="2880" w:hanging="360"/>
+      </w:pPr>
+      <w:rPr>
+        <w:rFonts w:ascii="Wingdings" w:hAnsi="Wingdings" w:hint="default"/>
+        <w:sz w:val="20"/>
+      </w:rPr>
+    </w:lvl>
+    <w:lvl w:ilvl="4" w:tentative="1">
+      <w:start w:val="1"/>
+      <w:numFmt w:val="bullet"/>
+      <w:lvlText w:val=""/>
+      <w:lvlJc w:val="left"/>
+      <w:pPr>
+        <w:tabs>
+          <w:tab w:val="num" w:pos="3600"/>
+        </w:tabs>
+        <w:ind w:left="3600" w:hanging="360"/>
+      </w:pPr>
+      <w:rPr>
+        <w:rFonts w:ascii="Wingdings" w:hAnsi="Wingdings" w:hint="default"/>
+        <w:sz w:val="20"/>
+      </w:rPr>
+    </w:lvl>
+    <w:lvl w:ilvl="5" w:tentative="1">
+      <w:start w:val="1"/>
+      <w:numFmt w:val="bullet"/>
+      <w:lvlText w:val=""/>
+      <w:lvlJc w:val="left"/>
+      <w:pPr>
+        <w:tabs>
+          <w:tab w:val="num" w:pos="4320"/>
+        </w:tabs>
+        <w:ind w:left="4320" w:hanging="360"/>
+      </w:pPr>
+      <w:rPr>
+        <w:rFonts w:ascii="Wingdings" w:hAnsi="Wingdings" w:hint="default"/>
+        <w:sz w:val="20"/>
+      </w:rPr>
+    </w:lvl>
+    <w:lvl w:ilvl="6" w:tentative="1">
+      <w:start w:val="1"/>
+      <w:numFmt w:val="bullet"/>
+      <w:lvlText w:val=""/>
+      <w:lvlJc w:val="left"/>
+      <w:pPr>
+        <w:tabs>
+          <w:tab w:val="num" w:pos="5040"/>
+        </w:tabs>
+        <w:ind w:left="5040" w:hanging="360"/>
+      </w:pPr>
+      <w:rPr>
+        <w:rFonts w:ascii="Wingdings" w:hAnsi="Wingdings" w:hint="default"/>
+        <w:sz w:val="20"/>
+      </w:rPr>
+    </w:lvl>
+    <w:lvl w:ilvl="7" w:tentative="1">
+      <w:start w:val="1"/>
+      <w:numFmt w:val="bullet"/>
+      <w:lvlText w:val=""/>
+      <w:lvlJc w:val="left"/>
+      <w:pPr>
+        <w:tabs>
+          <w:tab w:val="num" w:pos="5760"/>
+        </w:tabs>
+        <w:ind w:left="5760" w:hanging="360"/>
+      </w:pPr>
+      <w:rPr>
+        <w:rFonts w:ascii="Wingdings" w:hAnsi="Wingdings" w:hint="default"/>
+        <w:sz w:val="20"/>
+      </w:rPr>
+    </w:lvl>
+    <w:lvl w:ilvl="8" w:tentative="1">
+      <w:start w:val="1"/>
+      <w:numFmt w:val="bullet"/>
+      <w:lvlText w:val=""/>
+      <w:lvlJc w:val="left"/>
+      <w:pPr>
+        <w:tabs>
+          <w:tab w:val="num" w:pos="6480"/>
+        </w:tabs>
+        <w:ind w:left="6480" w:hanging="360"/>
+      </w:pPr>
+      <w:rPr>
+        <w:rFonts w:ascii="Wingdings" w:hAnsi="Wingdings" w:hint="default"/>
+        <w:sz w:val="20"/>
+      </w:rPr>
+    </w:lvl>
+  </w:abstractNum>
+  <w:num w:numId="1" w16cid:durableId="1940601912">
+    <w:abstractNumId w:val="1"/>
+  </w:num>
+  <w:num w:numId="2" w16cid:durableId="2032368602">
+    <w:abstractNumId w:val="4"/>
+  </w:num>
+  <w:num w:numId="3" w16cid:durableId="1782920167">
+    <w:abstractNumId w:val="0"/>
+  </w:num>
+  <w:num w:numId="4" w16cid:durableId="1759979188">
+    <w:abstractNumId w:val="2"/>
+  </w:num>
+  <w:num w:numId="5" w16cid:durableId="2029522767">
+    <w:abstractNumId w:val="3"/>
+  </w:num>
+</w:numbering>
 </file>
 
 <file path=word/styles.xml><?xml version="1.0" encoding="utf-8"?>
@@ -787,7 +2465,6 @@
   <w:style w:type="character" w:default="1" w:styleId="Fuentedeprrafopredeter">
     <w:name w:val="Default Paragraph Font"/>
     <w:uiPriority w:val="1"/>
-    <w:semiHidden/>
     <w:unhideWhenUsed/>
   </w:style>
   <w:style w:type="table" w:default="1" w:styleId="Tablanormal">
@@ -1099,6 +2776,29 @@
       <w:smallCaps/>
       <w:color w:val="0F4761" w:themeColor="accent1" w:themeShade="BF"/>
       <w:spacing w:val="5"/>
+    </w:rPr>
+  </w:style>
+  <w:style w:type="character" w:styleId="Hipervnculo">
+    <w:name w:val="Hyperlink"/>
+    <w:basedOn w:val="Fuentedeprrafopredeter"/>
+    <w:uiPriority w:val="99"/>
+    <w:unhideWhenUsed/>
+    <w:rsid w:val="008C5054"/>
+    <w:rPr>
+      <w:color w:val="467886" w:themeColor="hyperlink"/>
+      <w:u w:val="single"/>
+    </w:rPr>
+  </w:style>
+  <w:style w:type="character" w:styleId="Mencinsinresolver">
+    <w:name w:val="Unresolved Mention"/>
+    <w:basedOn w:val="Fuentedeprrafopredeter"/>
+    <w:uiPriority w:val="99"/>
+    <w:semiHidden/>
+    <w:unhideWhenUsed/>
+    <w:rsid w:val="008C5054"/>
+    <w:rPr>
+      <w:color w:val="605E5C"/>
+      <w:shd w:val="clear" w:color="auto" w:fill="E1DFDD"/>
     </w:rPr>
   </w:style>
 </w:styles>

</xml_diff>